<commit_message>
Changed Sample doc to be able to be tested for this weeks milestone.
We added in sections that cover in tables and images, such as covered for the previous headers, subheaders, content, etc. We made sure everything runs through the same way with parents, and titles.
</commit_message>
<xml_diff>
--- a/sample-documents/Sample Document.docx
+++ b/sample-documents/Sample Document.docx
@@ -24,15 +24,7 @@
     </w:p>
     <w:p>
       <w:r>
-        <w:t xml:space="preserve">But we want to understand what </w:t>
-      </w:r>
-      <w:proofErr w:type="gramStart"/>
-      <w:r>
-        <w:t>is a "paragraph"</w:t>
-      </w:r>
-      <w:proofErr w:type="gramEnd"/>
-      <w:r>
-        <w:t xml:space="preserve"> in Word.</w:t>
+        <w:t>But we want to understand what is a "paragraph" in Word.</w:t>
       </w:r>
     </w:p>
     <w:p>
@@ -47,15 +39,7 @@
     </w:p>
     <w:p>
       <w:r>
-        <w:t xml:space="preserve">We also want to understand what </w:t>
-      </w:r>
-      <w:proofErr w:type="gramStart"/>
-      <w:r>
-        <w:t>is a style</w:t>
-      </w:r>
-      <w:proofErr w:type="gramEnd"/>
-      <w:r>
-        <w:t>.</w:t>
+        <w:t>We also want to understand what is a style.</w:t>
       </w:r>
     </w:p>
     <w:p>
@@ -69,6 +53,45 @@
       <w:bookmarkEnd w:id="2"/>
     </w:p>
     <w:p>
+      <w:r>
+        <w:drawing>
+          <wp:inline distT="0" distB="0" distL="0" distR="0" wp14:anchorId="64917A46" wp14:editId="3C0CCEA9">
+            <wp:extent cx="1928027" cy="739204"/>
+            <wp:effectExtent l="0" t="0" r="0" b="3810"/>
+            <wp:docPr id="7592996" name="Picture 1"/>
+            <wp:cNvGraphicFramePr>
+              <a:graphicFrameLocks xmlns:a="http://schemas.openxmlformats.org/drawingml/2006/main" noChangeAspect="1"/>
+            </wp:cNvGraphicFramePr>
+            <a:graphic xmlns:a="http://schemas.openxmlformats.org/drawingml/2006/main">
+              <a:graphicData uri="http://schemas.openxmlformats.org/drawingml/2006/picture">
+                <pic:pic xmlns:pic="http://schemas.openxmlformats.org/drawingml/2006/picture">
+                  <pic:nvPicPr>
+                    <pic:cNvPr id="7592996" name=""/>
+                    <pic:cNvPicPr/>
+                  </pic:nvPicPr>
+                  <pic:blipFill>
+                    <a:blip r:embed="rId5"/>
+                    <a:stretch>
+                      <a:fillRect/>
+                    </a:stretch>
+                  </pic:blipFill>
+                  <pic:spPr>
+                    <a:xfrm>
+                      <a:off x="0" y="0"/>
+                      <a:ext cx="1928027" cy="739204"/>
+                    </a:xfrm>
+                    <a:prstGeom prst="rect">
+                      <a:avLst/>
+                    </a:prstGeom>
+                  </pic:spPr>
+                </pic:pic>
+              </a:graphicData>
+            </a:graphic>
+          </wp:inline>
+        </w:drawing>
+      </w:r>
+    </w:p>
+    <w:p>
       <w:pPr>
         <w:pStyle w:val="Heading1"/>
       </w:pPr>
@@ -78,6 +101,130 @@
       </w:r>
       <w:bookmarkEnd w:id="3"/>
     </w:p>
+    <w:p/>
+    <w:tbl>
+      <w:tblPr>
+        <w:tblStyle w:val="TableGrid"/>
+        <w:tblW w:w="0" w:type="auto"/>
+        <w:tblLook w:val="04A0" w:firstRow="1" w:lastRow="0" w:firstColumn="1" w:lastColumn="0" w:noHBand="0" w:noVBand="1"/>
+      </w:tblPr>
+      <w:tblGrid>
+        <w:gridCol w:w="3116"/>
+        <w:gridCol w:w="3117"/>
+        <w:gridCol w:w="3117"/>
+      </w:tblGrid>
+      <w:tr>
+        <w:tc>
+          <w:tcPr>
+            <w:tcW w:w="3116" w:type="dxa"/>
+          </w:tcPr>
+          <w:p>
+            <w:pPr>
+              <w:tabs>
+                <w:tab w:val="left" w:pos="2208"/>
+              </w:tabs>
+            </w:pPr>
+            <w:r>
+              <w:t>Insert 1</w:t>
+            </w:r>
+            <w:r>
+              <w:tab/>
+            </w:r>
+          </w:p>
+        </w:tc>
+        <w:tc>
+          <w:tcPr>
+            <w:tcW w:w="3117" w:type="dxa"/>
+          </w:tcPr>
+          <w:p>
+            <w:r>
+              <w:t xml:space="preserve">Insert </w:t>
+            </w:r>
+            <w:r>
+              <w:t>2</w:t>
+            </w:r>
+          </w:p>
+        </w:tc>
+        <w:tc>
+          <w:tcPr>
+            <w:tcW w:w="3117" w:type="dxa"/>
+          </w:tcPr>
+          <w:p>
+            <w:r>
+              <w:t xml:space="preserve">Insert </w:t>
+            </w:r>
+            <w:r>
+              <w:t>3</w:t>
+            </w:r>
+          </w:p>
+        </w:tc>
+      </w:tr>
+      <w:tr>
+        <w:tc>
+          <w:tcPr>
+            <w:tcW w:w="3116" w:type="dxa"/>
+          </w:tcPr>
+          <w:p>
+            <w:r>
+              <w:t>Dolphins</w:t>
+            </w:r>
+          </w:p>
+        </w:tc>
+        <w:tc>
+          <w:tcPr>
+            <w:tcW w:w="3117" w:type="dxa"/>
+          </w:tcPr>
+          <w:p>
+            <w:r>
+              <w:t>Celtics</w:t>
+            </w:r>
+          </w:p>
+        </w:tc>
+        <w:tc>
+          <w:tcPr>
+            <w:tcW w:w="3117" w:type="dxa"/>
+          </w:tcPr>
+          <w:p>
+            <w:r>
+              <w:t>Tiger Woods</w:t>
+            </w:r>
+          </w:p>
+        </w:tc>
+      </w:tr>
+      <w:tr>
+        <w:tc>
+          <w:tcPr>
+            <w:tcW w:w="3116" w:type="dxa"/>
+          </w:tcPr>
+          <w:p>
+            <w:r>
+              <w:t>Lions</w:t>
+            </w:r>
+          </w:p>
+        </w:tc>
+        <w:tc>
+          <w:tcPr>
+            <w:tcW w:w="3117" w:type="dxa"/>
+          </w:tcPr>
+          <w:p>
+            <w:r>
+              <w:t>Heats</w:t>
+            </w:r>
+          </w:p>
+        </w:tc>
+        <w:tc>
+          <w:tcPr>
+            <w:tcW w:w="3117" w:type="dxa"/>
+          </w:tcPr>
+          <w:p>
+            <w:r>
+              <w:t>Mike Tyson</w:t>
+            </w:r>
+          </w:p>
+        </w:tc>
+      </w:tr>
+    </w:tbl>
+    <w:p/>
     <w:sectPr>
       <w:pgSz w:w="12240" w:h="15840"/>
       <w:pgMar w:top="1440" w:right="1440" w:bottom="1440" w:left="1440" w:header="720" w:footer="720" w:gutter="0"/>
@@ -1058,6 +1205,25 @@
       <w:u w:val="single"/>
     </w:rPr>
   </w:style>
+  <w:style w:type="table" w:styleId="TableGrid">
+    <w:name w:val="Table Grid"/>
+    <w:basedOn w:val="TableNormal"/>
+    <w:uiPriority w:val="39"/>
+    <w:rsid w:val="00174B41"/>
+    <w:pPr>
+      <w:spacing w:after="0" w:line="240" w:lineRule="auto"/>
+    </w:pPr>
+    <w:tblPr>
+      <w:tblBorders>
+        <w:top w:val="single" w:sz="4" w:space="0" w:color="auto"/>
+        <w:left w:val="single" w:sz="4" w:space="0" w:color="auto"/>
+        <w:bottom w:val="single" w:sz="4" w:space="0" w:color="auto"/>
+        <w:right w:val="single" w:sz="4" w:space="0" w:color="auto"/>
+        <w:insideH w:val="single" w:sz="4" w:space="0" w:color="auto"/>
+        <w:insideV w:val="single" w:sz="4" w:space="0" w:color="auto"/>
+      </w:tblBorders>
+    </w:tblPr>
+  </w:style>
 </w:styles>
 </file>
 

</xml_diff>

<commit_message>
Before Meeting: Implemented style exceptioms for bold, underlined, etc. Enable images, as well as make sure this carries over for tables.
After Meeting:
Cared over the test1 and 2 .json's mainually and compaired outputs.
</commit_message>
<xml_diff>
--- a/sample-documents/Sample Document.docx
+++ b/sample-documents/Sample Document.docx
@@ -18,13 +18,34 @@
       </w:r>
     </w:p>
     <w:p>
-      <w:r>
+      <w:pPr>
+        <w:rPr>
+          <w:b/>
+          <w:bCs/>
+        </w:rPr>
+      </w:pPr>
+      <w:r>
+        <w:rPr>
+          <w:b/>
+          <w:bCs/>
+        </w:rPr>
         <w:t>The contents really don't matter.</w:t>
       </w:r>
     </w:p>
     <w:p>
-      <w:r>
-        <w:t>But we want to understand what is a "paragraph" in Word.</w:t>
+      <w:pPr>
+        <w:ind w:firstLine="720"/>
+      </w:pPr>
+      <w:r>
+        <w:t xml:space="preserve">But we want to understand what </w:t>
+      </w:r>
+      <w:proofErr w:type="gramStart"/>
+      <w:r>
+        <w:t>is a "paragraph"</w:t>
+      </w:r>
+      <w:proofErr w:type="gramEnd"/>
+      <w:r>
+        <w:t xml:space="preserve"> in Word.</w:t>
       </w:r>
     </w:p>
     <w:p>
@@ -39,7 +60,15 @@
     </w:p>
     <w:p>
       <w:r>
-        <w:t>We also want to understand what is a style.</w:t>
+        <w:t xml:space="preserve">We also want to understand what </w:t>
+      </w:r>
+      <w:proofErr w:type="gramStart"/>
+      <w:r>
+        <w:t>is a style</w:t>
+      </w:r>
+      <w:proofErr w:type="gramEnd"/>
+      <w:r>
+        <w:t>.</w:t>
       </w:r>
     </w:p>
     <w:p>
@@ -54,6 +83,9 @@
     </w:p>
     <w:p>
       <w:r>
+        <w:rPr>
+          <w:noProof/>
+        </w:rPr>
         <w:drawing>
           <wp:inline distT="0" distB="0" distL="0" distR="0" wp14:anchorId="64917A46" wp14:editId="3C0CCEA9">
             <wp:extent cx="1928027" cy="739204"/>
@@ -70,7 +102,7 @@
                     <pic:cNvPicPr/>
                   </pic:nvPicPr>
                   <pic:blipFill>
-                    <a:blip r:embed="rId5"/>
+                    <a:blip r:embed="rId6"/>
                     <a:stretch>
                       <a:fillRect/>
                     </a:stretch>
@@ -101,7 +133,98 @@
       </w:r>
       <w:bookmarkEnd w:id="3"/>
     </w:p>
+    <w:p>
+      <w:r>
+        <w:t>111.11, 11.11, 1., A, D., (C), 1.1.1</w:t>
+      </w:r>
+    </w:p>
     <w:p/>
+    <w:p>
+      <w:pPr>
+        <w:pStyle w:val="ListParagraph"/>
+        <w:numPr>
+          <w:ilvl w:val="0"/>
+          <w:numId w:val="1"/>
+        </w:numPr>
+        <w:rPr>
+          <w:rFonts w:ascii="Aptos" w:hAnsi="Aptos"/>
+        </w:rPr>
+      </w:pPr>
+      <w:r>
+        <w:rPr>
+          <w:rFonts w:ascii="Aptos" w:hAnsi="Aptos"/>
+        </w:rPr>
+        <w:t>Football</w:t>
+      </w:r>
+      <w:r>
+        <w:rPr>
+          <w:rFonts w:ascii="Aptos" w:hAnsi="Aptos"/>
+        </w:rPr>
+        <w:tab/>
+      </w:r>
+      <w:r>
+        <w:rPr>
+          <w:rFonts w:ascii="Aptos" w:hAnsi="Aptos"/>
+        </w:rPr>
+        <w:tab/>
+      </w:r>
+      <w:r>
+        <w:rPr>
+          <w:rFonts w:ascii="Aptos" w:hAnsi="Aptos"/>
+        </w:rPr>
+        <w:tab/>
+        <w:t xml:space="preserve">     </w:t>
+      </w:r>
+    </w:p>
+    <w:p>
+      <w:pPr>
+        <w:pStyle w:val="ListParagraph"/>
+        <w:numPr>
+          <w:ilvl w:val="0"/>
+          <w:numId w:val="1"/>
+        </w:numPr>
+        <w:rPr>
+          <w:rFonts w:ascii="Aptos" w:hAnsi="Aptos"/>
+        </w:rPr>
+      </w:pPr>
+      <w:r>
+        <w:rPr>
+          <w:rFonts w:ascii="Aptos" w:hAnsi="Aptos"/>
+        </w:rPr>
+        <w:t xml:space="preserve">Basketball </w:t>
+      </w:r>
+      <w:r>
+        <w:rPr>
+          <w:rFonts w:ascii="Aptos" w:hAnsi="Aptos"/>
+        </w:rPr>
+        <w:tab/>
+      </w:r>
+      <w:r>
+        <w:rPr>
+          <w:rFonts w:ascii="Aptos" w:hAnsi="Aptos"/>
+        </w:rPr>
+        <w:tab/>
+        <w:t xml:space="preserve">          </w:t>
+      </w:r>
+    </w:p>
+    <w:p>
+      <w:pPr>
+        <w:pStyle w:val="ListParagraph"/>
+        <w:numPr>
+          <w:ilvl w:val="0"/>
+          <w:numId w:val="1"/>
+        </w:numPr>
+        <w:rPr>
+          <w:rFonts w:ascii="Aptos" w:hAnsi="Aptos" w:cs="Times New Roman"/>
+        </w:rPr>
+      </w:pPr>
+      <w:r>
+        <w:rPr>
+          <w:rFonts w:ascii="Aptos" w:hAnsi="Aptos" w:cs="Times New Roman"/>
+        </w:rPr>
+        <w:t>People</w:t>
+      </w:r>
+    </w:p>
     <w:tbl>
       <w:tblPr>
         <w:tblStyle w:val="TableGrid"/>
@@ -138,10 +261,7 @@
           </w:tcPr>
           <w:p>
             <w:r>
-              <w:t xml:space="preserve">Insert </w:t>
-            </w:r>
-            <w:r>
-              <w:t>2</w:t>
+              <w:t>Insert 2</w:t>
             </w:r>
           </w:p>
         </w:tc>
@@ -151,10 +271,7 @@
           </w:tcPr>
           <w:p>
             <w:r>
-              <w:t xml:space="preserve">Insert </w:t>
-            </w:r>
-            <w:r>
-              <w:t>3</w:t>
+              <w:t>Insert 3</w:t>
             </w:r>
           </w:p>
         </w:tc>
@@ -225,6 +342,24 @@
       </w:tr>
     </w:tbl>
     <w:p/>
+    <w:p/>
+    <w:p>
+      <w:pPr>
+        <w:rPr>
+          <w:rFonts w:ascii="Times New Roman" w:hAnsi="Times New Roman" w:cs="Times New Roman"/>
+          <w:i/>
+          <w:iCs/>
+        </w:rPr>
+      </w:pPr>
+      <w:r>
+        <w:rPr>
+          <w:rFonts w:ascii="Times New Roman" w:hAnsi="Times New Roman" w:cs="Times New Roman"/>
+          <w:i/>
+          <w:iCs/>
+        </w:rPr>
+        <w:t>Name</w:t>
+      </w:r>
+    </w:p>
     <w:sectPr>
       <w:pgSz w:w="12240" w:h="15840"/>
       <w:pgMar w:top="1440" w:right="1440" w:bottom="1440" w:left="1440" w:header="720" w:footer="720" w:gutter="0"/>
@@ -233,6 +368,100 @@
     </w:sectPr>
   </w:body>
 </w:document>
+</file>
+
+<file path=word/numbering.xml><?xml version="1.0" encoding="utf-8"?>
+<w:numbering xmlns:wpc="http://schemas.microsoft.com/office/word/2010/wordprocessingCanvas" xmlns:cx="http://schemas.microsoft.com/office/drawing/2014/chartex" xmlns:cx1="http://schemas.microsoft.com/office/drawing/2015/9/8/chartex" xmlns:cx2="http://schemas.microsoft.com/office/drawing/2015/10/21/chartex" xmlns:cx3="http://schemas.microsoft.com/office/drawing/2016/5/9/chartex" xmlns:cx4="http://schemas.microsoft.com/office/drawing/2016/5/10/chartex" xmlns:cx5="http://schemas.microsoft.com/office/drawing/2016/5/11/chartex" xmlns:cx6="http://schemas.microsoft.com/office/drawing/2016/5/12/chartex" xmlns:cx7="http://schemas.microsoft.com/office/drawing/2016/5/13/chartex" xmlns:cx8="http://schemas.microsoft.com/office/drawing/2016/5/14/chartex" xmlns:mc="http://schemas.openxmlformats.org/markup-compatibility/2006" xmlns:aink="http://schemas.microsoft.com/office/drawing/2016/ink" xmlns:am3d="http://schemas.microsoft.com/office/drawing/2017/model3d" xmlns:o="urn:schemas-microsoft-com:office:office" xmlns:oel="http://schemas.microsoft.com/office/2019/extlst" xmlns:r="http://schemas.openxmlformats.org/officeDocument/2006/relationships" xmlns:m="http://schemas.openxmlformats.org/officeDocument/2006/math" xmlns:v="urn:schemas-microsoft-com:vml" xmlns:wp14="http://schemas.microsoft.com/office/word/2010/wordprocessingDrawing" xmlns:wp="http://schemas.openxmlformats.org/drawingml/2006/wordprocessingDrawing" xmlns:w10="urn:schemas-microsoft-com:office:word" xmlns:w="http://schemas.openxmlformats.org/wordprocessingml/2006/main" xmlns:w14="http://schemas.microsoft.com/office/word/2010/wordml" xmlns:w15="http://schemas.microsoft.com/office/word/2012/wordml" xmlns:w16cex="http://schemas.microsoft.com/office/word/2018/wordml/cex" xmlns:w16cid="http://schemas.microsoft.com/office/word/2016/wordml/cid" xmlns:w16="http://schemas.microsoft.com/office/word/2018/wordml" xmlns:w16du="http://schemas.microsoft.com/office/word/2023/wordml/word16du" xmlns:w16sdtdh="http://schemas.microsoft.com/office/word/2020/wordml/sdtdatahash" xmlns:w16sdtfl="http://schemas.microsoft.com/office/word/2024/wordml/sdtformatlock" xmlns:w16se="http://schemas.microsoft.com/office/word/2015/wordml/symex" xmlns:wpg="http://schemas.microsoft.com/office/word/2010/wordprocessingGroup" xmlns:wpi="http://schemas.microsoft.com/office/word/2010/wordprocessingInk" xmlns:wne="http://schemas.microsoft.com/office/word/2006/wordml" xmlns:wps="http://schemas.microsoft.com/office/word/2010/wordprocessingShape" mc:Ignorable="w14 w15 w16se w16cid w16 w16cex w16sdtdh w16sdtfl w16du wp14">
+  <w:abstractNum w:abstractNumId="0" w15:restartNumberingAfterBreak="0">
+    <w:nsid w:val="25AB4C5C"/>
+    <w:multiLevelType w:val="hybridMultilevel"/>
+    <w:tmpl w:val="429488D2"/>
+    <w:lvl w:ilvl="0" w:tplc="0409000F">
+      <w:start w:val="1"/>
+      <w:numFmt w:val="decimal"/>
+      <w:lvlText w:val="%1."/>
+      <w:lvlJc w:val="left"/>
+      <w:pPr>
+        <w:ind w:left="720" w:hanging="360"/>
+      </w:pPr>
+    </w:lvl>
+    <w:lvl w:ilvl="1" w:tplc="04090019" w:tentative="1">
+      <w:start w:val="1"/>
+      <w:numFmt w:val="lowerLetter"/>
+      <w:lvlText w:val="%2."/>
+      <w:lvlJc w:val="left"/>
+      <w:pPr>
+        <w:ind w:left="1440" w:hanging="360"/>
+      </w:pPr>
+    </w:lvl>
+    <w:lvl w:ilvl="2" w:tplc="0409001B" w:tentative="1">
+      <w:start w:val="1"/>
+      <w:numFmt w:val="lowerRoman"/>
+      <w:lvlText w:val="%3."/>
+      <w:lvlJc w:val="right"/>
+      <w:pPr>
+        <w:ind w:left="2160" w:hanging="180"/>
+      </w:pPr>
+    </w:lvl>
+    <w:lvl w:ilvl="3" w:tplc="0409000F" w:tentative="1">
+      <w:start w:val="1"/>
+      <w:numFmt w:val="decimal"/>
+      <w:lvlText w:val="%4."/>
+      <w:lvlJc w:val="left"/>
+      <w:pPr>
+        <w:ind w:left="2880" w:hanging="360"/>
+      </w:pPr>
+    </w:lvl>
+    <w:lvl w:ilvl="4" w:tplc="04090019" w:tentative="1">
+      <w:start w:val="1"/>
+      <w:numFmt w:val="lowerLetter"/>
+      <w:lvlText w:val="%5."/>
+      <w:lvlJc w:val="left"/>
+      <w:pPr>
+        <w:ind w:left="3600" w:hanging="360"/>
+      </w:pPr>
+    </w:lvl>
+    <w:lvl w:ilvl="5" w:tplc="0409001B" w:tentative="1">
+      <w:start w:val="1"/>
+      <w:numFmt w:val="lowerRoman"/>
+      <w:lvlText w:val="%6."/>
+      <w:lvlJc w:val="right"/>
+      <w:pPr>
+        <w:ind w:left="4320" w:hanging="180"/>
+      </w:pPr>
+    </w:lvl>
+    <w:lvl w:ilvl="6" w:tplc="0409000F" w:tentative="1">
+      <w:start w:val="1"/>
+      <w:numFmt w:val="decimal"/>
+      <w:lvlText w:val="%7."/>
+      <w:lvlJc w:val="left"/>
+      <w:pPr>
+        <w:ind w:left="5040" w:hanging="360"/>
+      </w:pPr>
+    </w:lvl>
+    <w:lvl w:ilvl="7" w:tplc="04090019" w:tentative="1">
+      <w:start w:val="1"/>
+      <w:numFmt w:val="lowerLetter"/>
+      <w:lvlText w:val="%8."/>
+      <w:lvlJc w:val="left"/>
+      <w:pPr>
+        <w:ind w:left="5760" w:hanging="360"/>
+      </w:pPr>
+    </w:lvl>
+    <w:lvl w:ilvl="8" w:tplc="0409001B" w:tentative="1">
+      <w:start w:val="1"/>
+      <w:numFmt w:val="lowerRoman"/>
+      <w:lvlText w:val="%9."/>
+      <w:lvlJc w:val="right"/>
+      <w:pPr>
+        <w:ind w:left="6480" w:hanging="180"/>
+      </w:pPr>
+    </w:lvl>
+  </w:abstractNum>
+  <w:num w:numId="1" w16cid:durableId="1793472986">
+    <w:abstractNumId w:val="0"/>
+  </w:num>
+</w:numbering>
 </file>
 
 <file path=word/styles.xml><?xml version="1.0" encoding="utf-8"?>

</xml_diff>